<commit_message>
commit -m "Atualização da proposta e adição da carta de apresentação"
</commit_message>
<xml_diff>
--- a/candidatura/manuscript/proposta.docx
+++ b/candidatura/manuscript/proposta.docx
@@ -15,10 +15,10 @@
         <w:pStyle w:val="Subtitle"/>
       </w:pPr>
       <w:r>
-        <w:t xml:space="preserve">Práticas coletivas de construção com terra como campos de elaboração conceitual</w:t>
-      </w:r>
-    </w:p>
-    <w:bookmarkStart w:id="9" w:name="questão-de-investigação"/>
+        <w:t xml:space="preserve">Práticas colectivas de construção com terra como formas situadas de produção conceitual</w:t>
+      </w:r>
+    </w:p>
+    <w:bookmarkStart w:id="10" w:name="questão-de-investigação"/>
     <w:p>
       <w:pPr>
         <w:pStyle w:val="Heading1"/>
@@ -32,27 +32,105 @@
         <w:pStyle w:val="FirstParagraph"/>
       </w:pPr>
       <w:r>
-        <w:t xml:space="preserve">Este projeto investiga práticas coletivas com terra não prioritariamente como objetos culturais a serem documentados ou preservados, mas como campos materiais de pensamento capazes de produzir elaboração conceitual. Em vez de tratar práticas com barro e terra como casos empíricos aos quais uma teoria seria posteriormente aplicada, a investigação propõe abordá-las como interlocutoras epistemológicas através das quais conceitos como cuidado, materialidade, técnica e agenciamento coletivo podem ser repensados.</w:t>
-      </w:r>
-    </w:p>
-    <w:p>
-      <w:pPr>
-        <w:pStyle w:val="BodyText"/>
-      </w:pPr>
-      <w:r>
-        <w:t xml:space="preserve">No centro da investigação encontra-se a questão do cuidado — não como prescrição ética ou moral aplicada, mas como condição ontológica que emerge através do envolvimento material. Práticas construtivas com terra frequentemente exigem negociação contínua com instabilidade, humidade, gravidade, erosão, ritmo e atenção coletiva. Nesse contexto, o cuidado aparece menos como virtude abstrata e mais como modo de sustentar relações em processos nos quais a forma nunca é totalmente fixa ou autónoma. É precisamente nessa instabilidade constitutiva que as práticas com terra se tornam produtoras de pensamento — e não apenas objetos dele.</w:t>
-      </w:r>
-    </w:p>
-    <w:p>
-      <w:pPr>
-        <w:pStyle w:val="BodyText"/>
-      </w:pPr>
-      <w:r>
-        <w:t xml:space="preserve">O movimento teórico do projeto parte, portanto, da prática em direção à teoria, e não o contrário. Pensadoras e autores como María Puig de la Bellacasa, Karen Barad e Tim Ingold tornam-se relevantes não como modelos explicativos impostos externamente ao campo, mas porque as próprias práticas fazem emergir questões que entram em ressonância com debates contemporâneos do pós-humanismo e dos novos materialismos. Em última instância, o projeto procura investigar se processos coletivos de construção com terra podem funcionar como formas situadas de produção de conceitos — campos em que o barro e a terra operam como operadores epistemológicos através dos quais relações, formas de atenção e modos de conhecimento se tornam materialmente pensáveis.</w:t>
+        <w:t xml:space="preserve">Este projecto investiga práticas colectivas com terra não prioritariamente como objectos culturais a serem documentados ou preservados, mas como campos materiais através dos quais processos de elaboração conceitual podem emergir. Em vez de tratar práticas com barro e terra como casos empíricos aos quais uma teoria seria posteriormente aplicada, a investigação propõe abordá-las como interlocutoras epistemológicas através das quais conceitos como cuidado, materialidade, técnica e agenciamento colectivo podem ser repensados.</w:t>
+      </w:r>
+    </w:p>
+    <w:p>
+      <w:pPr>
+        <w:pStyle w:val="BodyText"/>
+      </w:pPr>
+      <w:r>
+        <w:t xml:space="preserve">No centro da investigação encontra-se a questão do cuidado — não como prescrição ética ou moral aplicada externamente às práticas, mas como condição material de sustentação de relações que emerge através do envolvimento com processos instáveis e precários. Práticas construtivas com terra frequentemente exigem negociação contínua com humidade, erosão, gravidade, ritmo, manutenção e atenção colectiva. Nesse contexto, o cuidado aparece menos como virtude abstracta e mais como modo de sustentar relações em processos nos quais a forma nunca é totalmente fixa ou autónoma.</w:t>
+      </w:r>
+    </w:p>
+    <w:p>
+      <w:pPr>
+        <w:pStyle w:val="BodyText"/>
+      </w:pPr>
+      <w:r>
+        <w:t xml:space="preserve">O movimento teórico do projeto parte, portanto, da prática em direção à teoria, e não o contrário. Pensadoras e autores como María Puig de la Bellacasa, Karen Barad e Tim Ingold tornam-se relevantes não como modelos explicativos impostos externamente ao campo, mas porque as próprias práticas fazem emergir questões que entram em ressonância com debates contemporâneos do pós-humanismo e dos novos materialismos. Em última instância, o projeto procura investigar se processos coletivos de construção com terra podem funcionar como formas situadas de produção de conceitos — campos em que o barro e a terra operam como meios materiais através dos quais relações, formas de atenção e modos de conhecimento podem emergir.</w:t>
+      </w:r>
+    </w:p>
+    <w:p>
+      <w:pPr>
+        <w:pStyle w:val="BodyText"/>
+      </w:pPr>
+      <w:r>
+        <w:t xml:space="preserve">A investigação organiza-se em torno da seguinte questão central: de que modo práticas colectivas de construção com terra podem operar como formas situadas de produção conceitual, através das quais noções como cuidado, técnica, materialidade e agenciamento colectivo se tornam materialmente pensáveis?</w:t>
+      </w:r>
+    </w:p>
+    <w:bookmarkStart w:id="9" w:name="objectivos-específicos"/>
+    <w:p>
+      <w:pPr>
+        <w:pStyle w:val="Heading2"/>
+      </w:pPr>
+      <w:r>
+        <w:t xml:space="preserve">Objectivos específicos</w:t>
+      </w:r>
+    </w:p>
+    <w:p>
+      <w:pPr>
+        <w:pStyle w:val="Compact"/>
+        <w:numPr>
+          <w:ilvl w:val="0"/>
+          <w:numId w:val="1001"/>
+        </w:numPr>
+      </w:pPr>
+      <w:r>
+        <w:t xml:space="preserve">Investigar como práticas colectivas com terra articulam coordenação, atenção e manutenção material.</w:t>
+      </w:r>
+    </w:p>
+    <w:p>
+      <w:pPr>
+        <w:pStyle w:val="Compact"/>
+        <w:numPr>
+          <w:ilvl w:val="0"/>
+          <w:numId w:val="1001"/>
+        </w:numPr>
+      </w:pPr>
+      <w:r>
+        <w:t xml:space="preserve">Analisar de que modo instabilidade, precariedade e transformação participam da produção de conhecimento nessas práticas.</w:t>
+      </w:r>
+    </w:p>
+    <w:p>
+      <w:pPr>
+        <w:pStyle w:val="Compact"/>
+        <w:numPr>
+          <w:ilvl w:val="0"/>
+          <w:numId w:val="1001"/>
+        </w:numPr>
+      </w:pPr>
+      <w:r>
+        <w:t xml:space="preserve">Colocar experiências etnográficas em diálogo com debates contemporâneos dos novos materialismos e da antropologia da prática.</w:t>
+      </w:r>
+    </w:p>
+    <w:p>
+      <w:pPr>
+        <w:pStyle w:val="Compact"/>
+        <w:numPr>
+          <w:ilvl w:val="0"/>
+          <w:numId w:val="1001"/>
+        </w:numPr>
+      </w:pPr>
+      <w:r>
+        <w:t xml:space="preserve">Contribuir para uma compreensão do património técnico enquanto prática viva, situada e continuamente renegociada.</w:t>
+      </w:r>
+    </w:p>
+    <w:p>
+      <w:pPr>
+        <w:pStyle w:val="Compact"/>
+        <w:numPr>
+          <w:ilvl w:val="0"/>
+          <w:numId w:val="1001"/>
+        </w:numPr>
+      </w:pPr>
+      <w:r>
+        <w:t xml:space="preserve">Examinar como processos construtivos com terra podem deslocar concepções tradicionais da relação entre matéria, técnica e conhecimento.</w:t>
       </w:r>
     </w:p>
     <w:bookmarkEnd w:id="9"/>
-    <w:bookmarkStart w:id="14" w:name="estado-da-arte"/>
+    <w:bookmarkEnd w:id="10"/>
+    <w:bookmarkStart w:id="15" w:name="estado-da-arte"/>
     <w:p>
       <w:pPr>
         <w:pStyle w:val="Heading1"/>
@@ -61,7 +139,7 @@
         <w:t xml:space="preserve">Estado da Arte</w:t>
       </w:r>
     </w:p>
-    <w:bookmarkStart w:id="10" w:name="X956fb5251207aca7a49ac178d07dae9bc260c94"/>
+    <w:bookmarkStart w:id="11" w:name="X956fb5251207aca7a49ac178d07dae9bc260c94"/>
     <w:p>
       <w:pPr>
         <w:pStyle w:val="Heading2"/>
@@ -208,8 +286,8 @@
         <w:t xml:space="preserve">O que estas autoras partilham — e o que as torna relevantes para este projeto — é a convicção de que o pensamento emerge do contacto, da fricção, do envolvimento com o que não se deixa estabilizar facilmente. É precisamente esta condição que as práticas com terra habitam de forma exemplar.</w:t>
       </w:r>
     </w:p>
-    <w:bookmarkEnd w:id="10"/>
-    <w:bookmarkStart w:id="11" w:name="X95b9b98672247f4b0ccd5fc0ecf8b1fe79aad92"/>
+    <w:bookmarkEnd w:id="11"/>
+    <w:bookmarkStart w:id="12" w:name="X95b9b98672247f4b0ccd5fc0ecf8b1fe79aad92"/>
     <w:p>
       <w:pPr>
         <w:pStyle w:val="Heading2"/>
@@ -326,8 +404,8 @@
         <w:t xml:space="preserve">O que esta tradição abre para o presente projeto é a possibilidade de tratar as práticas com terra não como objectos de descrição etnográfica, mas como campos em que formas específicas de atenção, de coordenação e de conhecimento se tornam materialmente possíveis. A questão não é o que os construtores sabem sobre a terra, mas o que emerge de pensar e agir em contacto permanente com ela.</w:t>
       </w:r>
     </w:p>
-    <w:bookmarkEnd w:id="11"/>
-    <w:bookmarkStart w:id="12" w:name="Xc03880ad357ee84055d4feecdb2acd90bd48e63"/>
+    <w:bookmarkEnd w:id="12"/>
+    <w:bookmarkStart w:id="13" w:name="Xc03880ad357ee84055d4feecdb2acd90bd48e63"/>
     <w:p>
       <w:pPr>
         <w:pStyle w:val="Heading2"/>
@@ -436,8 +514,8 @@
         <w:t xml:space="preserve">(2023), uma perspectiva radicalmente diferente da tradição académica ocidental: uma ontologia em que a terra não é recurso nem material, mas sujeito de relações — uma formulação que, vinda de dentro de uma tradição quilombola, entra em ressonância produtiva com os debates dos novos materialismos sem se reduzir a eles.</w:t>
       </w:r>
     </w:p>
-    <w:bookmarkEnd w:id="12"/>
-    <w:bookmarkStart w:id="13" w:name="lacuna-e-contribuição-original"/>
+    <w:bookmarkEnd w:id="13"/>
+    <w:bookmarkStart w:id="14" w:name="lacuna-e-contribuição-original"/>
     <w:p>
       <w:pPr>
         <w:pStyle w:val="Heading2"/>
@@ -459,12 +537,20 @@
         <w:pStyle w:val="BodyText"/>
       </w:pPr>
       <w:r>
-        <w:t xml:space="preserve">Esta investigação propõe ocupar esse espaço: tratar as práticas com terra como interlocutoras epistemológicas — não como casos empíricos que ilustram teorias, mas como campos em que conceitos como cuidado, agenciamento coletivo e instabilidade constitutiva se tornam materialmente pensáveis.</w:t>
-      </w:r>
-    </w:p>
-    <w:bookmarkEnd w:id="13"/>
+        <w:t xml:space="preserve">Esta investigação propõe ocupar esse espaço: tratar práticas colectivas com terra como interlocutoras epistemológicas — não como casos empíricos que ilustram teorias previamente estabelecidas, mas como campos em que conceitos como cuidado, agenciamento colectivo, técnica e instabilidade constitutiva se tornam materialmente pensáveis.</w:t>
+      </w:r>
+    </w:p>
+    <w:p>
+      <w:pPr>
+        <w:pStyle w:val="BodyText"/>
+      </w:pPr>
+      <w:r>
+        <w:t xml:space="preserve">A originalidade do projecto reside menos em aplicar teorias contemporâneas às práticas com terra do que em investigar como essas práticas podem deslocar, tensionar ou reformular os próprios termos através dos quais matéria, técnica e conhecimento têm sido tradicionalmente pensados. Nesse sentido, o projecto procura contribuir para debates contemporâneos em história e filosofia da técnica, particularmente no que diz respeito às relações entre materialidade, conhecimento situado e práticas colectivas de produção e transmissão técnica.</w:t>
+      </w:r>
+    </w:p>
     <w:bookmarkEnd w:id="14"/>
-    <w:bookmarkStart w:id="15" w:name="metodologia"/>
+    <w:bookmarkEnd w:id="15"/>
+    <w:bookmarkStart w:id="16" w:name="metodologia"/>
     <w:p>
       <w:pPr>
         <w:pStyle w:val="Heading1"/>
@@ -507,15 +593,23 @@
         <w:t xml:space="preserve">participação directa em processos construtivos com terra</w:t>
       </w:r>
       <w:r>
-        <w:t xml:space="preserve">, incluindo oficinas, mutirões e projectos de construção colectiva em contextos portugueses e ibero-americanos. Esta participação não é meramente observacional: implica o envolvimento corporal com os materiais, os gestos, os ritmos e as formas de coordenação que caracterizam estas práticas. Seguindo a proposta de Ingold, o investigador não estuda a prática de fora, mas aprende através dela — o que significa que o próprio processo de aprendizagem é um dado metodológico.</w:t>
-      </w:r>
-    </w:p>
-    <w:p>
-      <w:pPr>
-        <w:pStyle w:val="BodyText"/>
-      </w:pPr>
-      <w:r>
-        <w:t xml:space="preserve">A segunda modalidade é a</w:t>
+        <w:t xml:space="preserve">, incluindo oficinas, mutirões e projectos de construção colectiva em contextos portugueses e ibero-americanos. Esta participação não é meramente observacional: implica o envolvimento corporal com os materiais, os gestos, os ritmos e as formas de coordenação que caracterizam estas práticas. Seguindo a proposta de Ingold, o investigador procura aprender através da prática e do envolvimento material — o que significa que o próprio processo de aprendizagem constitui um dado metodológico.</w:t>
+      </w:r>
+    </w:p>
+    <w:p>
+      <w:pPr>
+        <w:pStyle w:val="BodyText"/>
+      </w:pPr>
+      <w:r>
+        <w:t xml:space="preserve">A segunda modalidade é a documentação etnográfica — registos em diário de campo, fotografia e vídeo — orientada não para a captura de factos, mas para a atenção a momentos de tensão, improvisação, negociação, adaptação e falha: por exemplo, decisões colectivas sobre mistura e manutenção, respostas a fissuras e erosão, formas de coordenação entre participantes, transmissão informal de técnicas e modos de atenção ao comportamento do material. São precisamente esses momentos — em que a forma resiste, o material cede de forma inesperada, ou a coordenação colectiva se reconfigura — que revelam as condições ontológicas das práticas com terra.</w:t>
+      </w:r>
+    </w:p>
+    <w:p>
+      <w:pPr>
+        <w:pStyle w:val="BodyText"/>
+      </w:pPr>
+      <w:r>
+        <w:t xml:space="preserve">A terceira modalidade é o</w:t>
       </w:r>
       <w:r>
         <w:t xml:space="preserve"> </w:t>
@@ -525,30 +619,6 @@
           <w:b/>
           <w:bCs/>
         </w:rPr>
-        <w:t xml:space="preserve">documentação etnográfica</w:t>
-      </w:r>
-      <w:r>
-        <w:t xml:space="preserve"> </w:t>
-      </w:r>
-      <w:r>
-        <w:t xml:space="preserve">— registos em diário de campo, fotografia e vídeo — orientada não para a captura de factos, mas para a atenção a momentos de tensão, improvisação, negociação e falha. São precisamente esses momentos — em que a forma resiste, o material cede de forma inesperada, ou a coordenação colectiva se reconfigura — que revelam as condições ontológicas das práticas com terra.</w:t>
-      </w:r>
-    </w:p>
-    <w:p>
-      <w:pPr>
-        <w:pStyle w:val="BodyText"/>
-      </w:pPr>
-      <w:r>
-        <w:t xml:space="preserve">A terceira modalidade é o</w:t>
-      </w:r>
-      <w:r>
-        <w:t xml:space="preserve"> </w:t>
-      </w:r>
-      <w:r>
-        <w:rPr>
-          <w:b/>
-          <w:bCs/>
-        </w:rPr>
         <w:t xml:space="preserve">diálogo com praticantes</w:t>
       </w:r>
       <w:r>
@@ -582,8 +652,8 @@
         <w:t xml:space="preserve">A análise do material recolhido orientar-se-á pela pergunta central da investigação: que tipos de conceitos emergem quando o pensamento permanece próximo de práticas materiais precárias nas quais forma, manutenção, gesto, ambiente e coordenação colectiva não podem ser claramente separados? O movimento analítico é, portanto, indutivo — da prática em direcção à teoria — sem que isso implique a ausência de enquadramento teórico prévio. Os debates dos novos materialismos e da antropologia da prática funcionam menos como grelhas de análise do que como interlocutores com quem o material empírico é colocado em diálogo.</w:t>
       </w:r>
     </w:p>
-    <w:bookmarkEnd w:id="15"/>
-    <w:bookmarkStart w:id="16" w:name="cronograma"/>
+    <w:bookmarkEnd w:id="16"/>
+    <w:bookmarkStart w:id="17" w:name="cronograma"/>
     <w:p>
       <w:pPr>
         <w:pStyle w:val="Heading1"/>
@@ -681,7 +751,7 @@
               <w:pStyle w:val="Compact"/>
             </w:pPr>
             <w:r>
-              <w:t xml:space="preserve">Trabalho de campo intensivo. Participação em mutirões e oficinas de construção com terra em Portugal e, se possível, no Brasil. Recolha e análise preliminar de material etnográfico. Primeira articulação dos conceitos emergentes.</w:t>
+              <w:t xml:space="preserve">Trabalho de campo intensivo. Participação em mutirões e oficinas de construção com terra em Portugal e, se possível, no Brasil. Recolha e análise preliminar de material etnográfico. Primeira articulação dos conceitos emergentes. Início da redacção de capítulos analíticos preliminares.</w:t>
             </w:r>
           </w:p>
         </w:tc>
@@ -743,8 +813,8 @@
         </w:tc>
       </w:tr>
     </w:tbl>
-    <w:bookmarkEnd w:id="16"/>
-    <w:bookmarkStart w:id="17" w:name="referências-bibliográficas"/>
+    <w:bookmarkEnd w:id="17"/>
+    <w:bookmarkStart w:id="18" w:name="referências-bibliográficas"/>
     <w:p>
       <w:pPr>
         <w:pStyle w:val="Heading1"/>
@@ -1185,7 +1255,7 @@
         <w:t xml:space="preserve">, 12(2), 122–135.</w:t>
       </w:r>
     </w:p>
-    <w:bookmarkEnd w:id="17"/>
+    <w:bookmarkEnd w:id="18"/>
     <w:sectPr>
       <w:footnotePr>
         <w:numRestart w:val="eachSect"/>
@@ -1296,8 +1366,114 @@
       </w:pPr>
     </w:lvl>
   </w:abstractNum>
+  <w:abstractNum w:abstractNumId="991">
+    <w:nsid w:val="0000A991"/>
+    <w:multiLevelType w:val="multilevel"/>
+    <w:lvl w:ilvl="0">
+      <w:numFmt w:val="bullet"/>
+      <w:lvlText w:val=""/>
+      <w:lvlJc w:val="left"/>
+      <w:pPr>
+        <w:ind w:left="720" w:hanging="360"/>
+      </w:pPr>
+      <w:rPr>
+        <w:rFonts w:ascii="Symbol" w:hAnsi="Symbol" w:cs="Symbol" w:hint="default"/>
+      </w:rPr>
+    </w:lvl>
+    <w:lvl w:ilvl="1">
+      <w:numFmt w:val="bullet"/>
+      <w:lvlText w:val="o"/>
+      <w:lvlJc w:val="left"/>
+      <w:pPr>
+        <w:ind w:left="1440" w:hanging="360"/>
+      </w:pPr>
+      <w:rPr>
+        <w:rFonts w:ascii="Courier New" w:hAnsi="Courier New" w:cs="Courier New" w:hint="default"/>
+      </w:rPr>
+    </w:lvl>
+    <w:lvl w:ilvl="2">
+      <w:numFmt w:val="bullet"/>
+      <w:lvlText w:val=""/>
+      <w:lvlJc w:val="left"/>
+      <w:pPr>
+        <w:ind w:left="2160" w:hanging="360"/>
+      </w:pPr>
+      <w:rPr>
+        <w:rFonts w:ascii="Wingdings" w:hAnsi="Wingdings" w:cs="Wingdings" w:hint="default"/>
+      </w:rPr>
+    </w:lvl>
+    <w:lvl w:ilvl="3">
+      <w:numFmt w:val="bullet"/>
+      <w:lvlText w:val=""/>
+      <w:lvlJc w:val="left"/>
+      <w:pPr>
+        <w:ind w:left="2880" w:hanging="360"/>
+      </w:pPr>
+      <w:rPr>
+        <w:rFonts w:ascii="Symbol" w:hAnsi="Symbol" w:cs="Symbol" w:hint="default"/>
+      </w:rPr>
+    </w:lvl>
+    <w:lvl w:ilvl="4">
+      <w:numFmt w:val="bullet"/>
+      <w:lvlText w:val="o"/>
+      <w:lvlJc w:val="left"/>
+      <w:pPr>
+        <w:ind w:left="3600" w:hanging="360"/>
+      </w:pPr>
+      <w:rPr>
+        <w:rFonts w:ascii="Courier New" w:hAnsi="Courier New" w:cs="Courier New" w:hint="default"/>
+      </w:rPr>
+    </w:lvl>
+    <w:lvl w:ilvl="5">
+      <w:numFmt w:val="bullet"/>
+      <w:lvlText w:val=""/>
+      <w:lvlJc w:val="left"/>
+      <w:pPr>
+        <w:ind w:left="4320" w:hanging="360"/>
+      </w:pPr>
+      <w:rPr>
+        <w:rFonts w:ascii="Wingdings" w:hAnsi="Wingdings" w:cs="Wingdings" w:hint="default"/>
+      </w:rPr>
+    </w:lvl>
+    <w:lvl w:ilvl="6">
+      <w:numFmt w:val="bullet"/>
+      <w:lvlText w:val=""/>
+      <w:lvlJc w:val="left"/>
+      <w:pPr>
+        <w:ind w:left="5040" w:hanging="360"/>
+      </w:pPr>
+      <w:rPr>
+        <w:rFonts w:ascii="Symbol" w:hAnsi="Symbol" w:cs="Symbol" w:hint="default"/>
+      </w:rPr>
+    </w:lvl>
+    <w:lvl w:ilvl="7">
+      <w:numFmt w:val="bullet"/>
+      <w:lvlText w:val="o"/>
+      <w:lvlJc w:val="left"/>
+      <w:pPr>
+        <w:ind w:left="5760" w:hanging="360"/>
+      </w:pPr>
+      <w:rPr>
+        <w:rFonts w:ascii="Courier New" w:hAnsi="Courier New" w:cs="Courier New" w:hint="default"/>
+      </w:rPr>
+    </w:lvl>
+    <w:lvl w:ilvl="8">
+      <w:numFmt w:val="bullet"/>
+      <w:lvlText w:val=""/>
+      <w:lvlJc w:val="left"/>
+      <w:pPr>
+        <w:ind w:left="6480" w:hanging="360"/>
+      </w:pPr>
+      <w:rPr>
+        <w:rFonts w:ascii="Wingdings" w:hAnsi="Wingdings" w:cs="Wingdings" w:hint="default"/>
+      </w:rPr>
+    </w:lvl>
+  </w:abstractNum>
   <w:num w:numId="1000">
     <w:abstractNumId w:val="990"/>
+  </w:num>
+  <w:num w:numId="1001">
+    <w:abstractNumId w:val="991"/>
   </w:num>
 </w:numbering>
 </file>

</xml_diff>

<commit_message>
commit -m "Atualização da proposta de candidatura"
</commit_message>
<xml_diff>
--- a/candidatura/manuscript/proposta.docx
+++ b/candidatura/manuscript/proposta.docx
@@ -18,12 +18,38 @@
         <w:t xml:space="preserve">Práticas colectivas de construção com terra como formas situadas de produção conceitual</w:t>
       </w:r>
     </w:p>
-    <w:bookmarkStart w:id="10" w:name="questão-de-investigação"/>
+    <w:bookmarkStart w:id="9" w:name="posicionamento-do-investigador"/>
     <w:p>
       <w:pPr>
         <w:pStyle w:val="Heading1"/>
       </w:pPr>
       <w:r>
+        <w:t xml:space="preserve">Posicionamento do investigador</w:t>
+      </w:r>
+    </w:p>
+    <w:p>
+      <w:pPr>
+        <w:pStyle w:val="FirstParagraph"/>
+      </w:pPr>
+      <w:r>
+        <w:t xml:space="preserve">Esta investigação emerge de um percurso situado na intersecção entre arquitectura, cerâmica e prática artística. Como arquitecto e ceramista, desenvolvi ao longo dos últimos anos um trabalho que articula o fazer com terra e barro cru em contextos colectivos e experimentais. No mestrado em Arte e Ciência do Vidro e Cerâmica (VICARTE, FCT-NOVA), investiguei práticas com terra a partir de dentro: instalações efémeras ao ar livre, vídeo-performances que interpretavam o valor simbólico do barro sobre o corpo, experimentos com algoritmos bio-inspirados aplicados ao comportamento do material, e instalações que exploravam a resposta colectiva diante da efemeridade e destruição da forma. Esse percurso conduziu a uma conclusão provisória que orienta o presente projecto: o cuidado emerge como dimensão constitutiva da sustentação de processos nos quais a precariedade não é uma limitação, mas a condição estrutural do fazer.</w:t>
+      </w:r>
+    </w:p>
+    <w:p>
+      <w:pPr>
+        <w:pStyle w:val="BodyText"/>
+      </w:pPr>
+      <w:r>
+        <w:t xml:space="preserve">O doutoramento não parte, portanto, de uma hipótese abstracta a verificar empiricamente. Parte de questões que emergiram da prática e que a prática, por si só, não consegue completamente articular. A proposta de tratar as práticas colectivas com terra como interlocutoras epistemológicas — como campos de produção conceitual e não apenas objectos de descrição — é uma aposta que o meu próprio percurso tornou necessária. O cruzamento entre a arquitectura com terra e o trabalho cerâmico permite-me habitar simultaneamente as dimensões técnica, material e colectiva destas práticas, o que constitui uma condição metodológica relevante para uma investigação que propõe aprender através do envolvimento directo com os materiais.</w:t>
+      </w:r>
+    </w:p>
+    <w:bookmarkEnd w:id="9"/>
+    <w:bookmarkStart w:id="11" w:name="questão-de-investigação"/>
+    <w:p>
+      <w:pPr>
+        <w:pStyle w:val="Heading1"/>
+      </w:pPr>
+      <w:r>
         <w:t xml:space="preserve">Questão de investigação</w:t>
       </w:r>
     </w:p>
@@ -59,7 +85,7 @@
         <w:t xml:space="preserve">A investigação organiza-se em torno da seguinte questão central: de que modo práticas colectivas de construção com terra podem operar como formas situadas de produção conceitual, através das quais noções como cuidado, técnica, materialidade e agenciamento colectivo se tornam materialmente pensáveis?</w:t>
       </w:r>
     </w:p>
-    <w:bookmarkStart w:id="9" w:name="objectivos-específicos"/>
+    <w:bookmarkStart w:id="10" w:name="objectivos-específicos"/>
     <w:p>
       <w:pPr>
         <w:pStyle w:val="Heading2"/>
@@ -128,9 +154,9 @@
         <w:t xml:space="preserve">Examinar como processos construtivos com terra podem deslocar concepções tradicionais da relação entre matéria, técnica e conhecimento.</w:t>
       </w:r>
     </w:p>
-    <w:bookmarkEnd w:id="9"/>
     <w:bookmarkEnd w:id="10"/>
-    <w:bookmarkStart w:id="15" w:name="estado-da-arte"/>
+    <w:bookmarkEnd w:id="11"/>
+    <w:bookmarkStart w:id="16" w:name="estado-da-arte"/>
     <w:p>
       <w:pPr>
         <w:pStyle w:val="Heading1"/>
@@ -139,7 +165,7 @@
         <w:t xml:space="preserve">Estado da Arte</w:t>
       </w:r>
     </w:p>
-    <w:bookmarkStart w:id="11" w:name="X956fb5251207aca7a49ac178d07dae9bc260c94"/>
+    <w:bookmarkStart w:id="12" w:name="X956fb5251207aca7a49ac178d07dae9bc260c94"/>
     <w:p>
       <w:pPr>
         <w:pStyle w:val="Heading2"/>
@@ -286,8 +312,8 @@
         <w:t xml:space="preserve">O que estas autoras partilham — e o que as torna relevantes para este projeto — é a convicção de que o pensamento emerge do contacto, da fricção, do envolvimento com o que não se deixa estabilizar facilmente. É precisamente esta condição que as práticas com terra habitam de forma exemplar.</w:t>
       </w:r>
     </w:p>
-    <w:bookmarkEnd w:id="11"/>
-    <w:bookmarkStart w:id="12" w:name="X95b9b98672247f4b0ccd5fc0ecf8b1fe79aad92"/>
+    <w:bookmarkEnd w:id="12"/>
+    <w:bookmarkStart w:id="13" w:name="X95b9b98672247f4b0ccd5fc0ecf8b1fe79aad92"/>
     <w:p>
       <w:pPr>
         <w:pStyle w:val="Heading2"/>
@@ -404,8 +430,8 @@
         <w:t xml:space="preserve">O que esta tradição abre para o presente projeto é a possibilidade de tratar as práticas com terra não como objectos de descrição etnográfica, mas como campos em que formas específicas de atenção, de coordenação e de conhecimento se tornam materialmente possíveis. A questão não é o que os construtores sabem sobre a terra, mas o que emerge de pensar e agir em contacto permanente com ela.</w:t>
       </w:r>
     </w:p>
-    <w:bookmarkEnd w:id="12"/>
-    <w:bookmarkStart w:id="13" w:name="Xc03880ad357ee84055d4feecdb2acd90bd48e63"/>
+    <w:bookmarkEnd w:id="13"/>
+    <w:bookmarkStart w:id="14" w:name="Xc03880ad357ee84055d4feecdb2acd90bd48e63"/>
     <w:p>
       <w:pPr>
         <w:pStyle w:val="Heading2"/>
@@ -514,8 +540,8 @@
         <w:t xml:space="preserve">(2023), uma perspectiva radicalmente diferente da tradição académica ocidental: uma ontologia em que a terra não é recurso nem material, mas sujeito de relações — uma formulação que, vinda de dentro de uma tradição quilombola, entra em ressonância produtiva com os debates dos novos materialismos sem se reduzir a eles.</w:t>
       </w:r>
     </w:p>
-    <w:bookmarkEnd w:id="13"/>
-    <w:bookmarkStart w:id="14" w:name="lacuna-e-contribuição-original"/>
+    <w:bookmarkEnd w:id="14"/>
+    <w:bookmarkStart w:id="15" w:name="lacuna-e-contribuição-original"/>
     <w:p>
       <w:pPr>
         <w:pStyle w:val="Heading2"/>
@@ -545,12 +571,12 @@
         <w:pStyle w:val="BodyText"/>
       </w:pPr>
       <w:r>
-        <w:t xml:space="preserve">A originalidade do projecto reside menos em aplicar teorias contemporâneas às práticas com terra do que em investigar como essas práticas podem deslocar, tensionar ou reformular os próprios termos através dos quais matéria, técnica e conhecimento têm sido tradicionalmente pensados. Nesse sentido, o projecto procura contribuir para debates contemporâneos em história e filosofia da técnica, particularmente no que diz respeito às relações entre materialidade, conhecimento situado e práticas colectivas de produção e transmissão técnica.</w:t>
-      </w:r>
-    </w:p>
-    <w:bookmarkEnd w:id="14"/>
+        <w:t xml:space="preserve">A originalidade do projecto reside menos em aplicar teorias contemporâneas às práticas com terra do que em investigar como essas práticas podem deslocar, tensionar ou reformular os próprios termos através dos quais matéria, técnica e conhecimento têm sido tradicionalmente pensados.Nesse sentido, o projecto insere-se no cruzamento entre filosofia da técnica e epistemologia das práticas materiais, procurando contribuir para debates contemporâneos em história e filosofia da tecnologia sobre as relações entre conhecimento situado, materialidade e práticas colectivas de produção e transmissão técnica — dimensões que o programa de Doutoramento em História, Filosofia e Património da Ciência e da Tecnologia oferece um enquadramento privilegiado para desenvolver.</w:t>
+      </w:r>
+    </w:p>
     <w:bookmarkEnd w:id="15"/>
-    <w:bookmarkStart w:id="16" w:name="metodologia"/>
+    <w:bookmarkEnd w:id="16"/>
+    <w:bookmarkStart w:id="17" w:name="metodologia"/>
     <w:p>
       <w:pPr>
         <w:pStyle w:val="Heading1"/>
@@ -652,8 +678,8 @@
         <w:t xml:space="preserve">A análise do material recolhido orientar-se-á pela pergunta central da investigação: que tipos de conceitos emergem quando o pensamento permanece próximo de práticas materiais precárias nas quais forma, manutenção, gesto, ambiente e coordenação colectiva não podem ser claramente separados? O movimento analítico é, portanto, indutivo — da prática em direcção à teoria — sem que isso implique a ausência de enquadramento teórico prévio. Os debates dos novos materialismos e da antropologia da prática funcionam menos como grelhas de análise do que como interlocutores com quem o material empírico é colocado em diálogo.</w:t>
       </w:r>
     </w:p>
-    <w:bookmarkEnd w:id="16"/>
-    <w:bookmarkStart w:id="17" w:name="cronograma"/>
+    <w:bookmarkEnd w:id="17"/>
+    <w:bookmarkStart w:id="18" w:name="cronograma"/>
     <w:p>
       <w:pPr>
         <w:pStyle w:val="Heading1"/>
@@ -813,8 +839,8 @@
         </w:tc>
       </w:tr>
     </w:tbl>
-    <w:bookmarkEnd w:id="17"/>
-    <w:bookmarkStart w:id="18" w:name="referências-bibliográficas"/>
+    <w:bookmarkEnd w:id="18"/>
+    <w:bookmarkStart w:id="19" w:name="referências-bibliográficas"/>
     <w:p>
       <w:pPr>
         <w:pStyle w:val="Heading1"/>
@@ -1255,7 +1281,7 @@
         <w:t xml:space="preserve">, 12(2), 122–135.</w:t>
       </w:r>
     </w:p>
-    <w:bookmarkEnd w:id="18"/>
+    <w:bookmarkEnd w:id="19"/>
     <w:sectPr>
       <w:footnotePr>
         <w:numRestart w:val="eachSect"/>

</xml_diff>